<commit_message>
Polish technical implementation document
</commit_message>
<xml_diff>
--- a/DOCUMENTACION_CONSTRUCCION_IMPLEMENTACION.docx
+++ b/DOCUMENTACION_CONSTRUCCION_IMPLEMENTACION.docx
@@ -4,6 +4,158 @@
   <w:body>
     <w:p>
       <w:pPr>
+        <w:jc w:val="center"/>
+        <w:spacing w:before="2000" w:after="360"/>
+      </w:pPr>
+      <w:r>
+        <w:rPr>
+          <w:b/>
+          <w:color w:val="1F5D2A"/>
+          <w:sz w:val="44"/>
+        </w:rPr>
+        <w:t>DOCUMENTACIÃ“N TÃ‰CNICA</w:t>
+      </w:r>
+    </w:p>
+    <w:p>
+      <w:pPr>
+        <w:jc w:val="center"/>
+        <w:spacing w:after="200"/>
+      </w:pPr>
+      <w:r>
+        <w:rPr>
+          <w:b/>
+          <w:color w:val="2E7D32"/>
+          <w:sz w:val="34"/>
+        </w:rPr>
+        <w:t>ConstrucciÃ³n e implementaciÃ³n de la soluciÃ³n de software</w:t>
+      </w:r>
+    </w:p>
+    <w:p>
+      <w:pPr>
+        <w:jc w:val="center"/>
+        <w:spacing w:after="900"/>
+      </w:pPr>
+      <w:r>
+        <w:rPr>
+          <w:sz w:val="28"/>
+        </w:rPr>
+        <w:t>Sistema de GestiÃ³n ClÃ­nica Dental Mi Sonrisa Feliz</w:t>
+      </w:r>
+    </w:p>
+    <w:p>
+      <w:pPr>
+        <w:jc w:val="center"/>
+      </w:pPr>
+      <w:r>
+        <w:rPr>
+          <w:color w:val="666666"/>
+          <w:sz w:val="22"/>
+        </w:rPr>
+        <w:t>Informe tÃ©cnico para presentaciÃ³n acadÃ©mica</w:t>
+      </w:r>
+    </w:p>
+    <w:p>
+      <w:pPr>
+        <w:jc w:val="center"/>
+        <w:spacing w:before="1600"/>
+      </w:pPr>
+      <w:r>
+        <w:rPr>
+          <w:sz w:val="22"/>
+        </w:rPr>
+        <w:t>Fecha de elaboraciÃ³n: 13 de septiembre de 2026</w:t>
+      </w:r>
+    </w:p>
+    <w:p>
+      <w:r>
+        <w:br w:type="page"/>
+      </w:r>
+    </w:p>
+    <w:p>
+      <w:pPr>
+        <w:pStyle w:val="Heading1"/>
+      </w:pPr>
+      <w:r>
+        <w:t>Ficha tÃ©cnica del proyecto</w:t>
+      </w:r>
+    </w:p>
+    <w:p>
+      <w:r>
+        <w:rPr>
+          <w:b/>
+        </w:rPr>
+        <w:t>Nombre del sistema: </w:t>
+      </w:r>
+      <w:r>
+        <w:t>Mi Sonrisa Feliz</w:t>
+      </w:r>
+    </w:p>
+    <w:p>
+      <w:r>
+        <w:rPr>
+          <w:b/>
+        </w:rPr>
+        <w:t>Tipo de soluciÃ³n: </w:t>
+      </w:r>
+      <w:r>
+        <w:t>AplicaciÃ³n web para la gestiÃ³n operativa de una clÃ­nica dental.</w:t>
+      </w:r>
+    </w:p>
+    <w:p>
+      <w:r>
+        <w:rPr>
+          <w:b/>
+        </w:rPr>
+        <w:t>Alcance: </w:t>
+      </w:r>
+      <w:r>
+        <w:t>GestiÃ³n de usuarios, pacientes, profesionales, citas, consultas, facturaciÃ³n, inventario y reportes.</w:t>
+      </w:r>
+    </w:p>
+    <w:p>
+      <w:r>
+        <w:rPr>
+          <w:b/>
+        </w:rPr>
+        <w:t>Modalidad: </w:t>
+      </w:r>
+      <w:r>
+        <w:t>AplicaciÃ³n web responsive, con soporte en espaÃ±ol e inglÃ©s.</w:t>
+      </w:r>
+    </w:p>
+    <w:p>
+      <w:pPr>
+        <w:pStyle w:val="Heading1"/>
+      </w:pPr>
+      <w:r>
+        <w:t>PropÃ³sito del documento</w:t>
+      </w:r>
+    </w:p>
+    <w:p>
+      <w:r>
+        <w:t>Este documento describe el proceso de anÃ¡lisis, diseÃ±o, construcciÃ³n, implementaciÃ³n y validaciÃ³n de la soluciÃ³n. Su objetivo es evidenciar las decisiones tÃ©cnicas adoptadas, los modelos utilizados, las funcionalidades desarrolladas y las medidas aplicadas para asegurar calidad, seguridad, mantenibilidad y usabilidad.</w:t>
+      </w:r>
+    </w:p>
+    <w:p>
+      <w:pPr>
+        <w:pStyle w:val="Heading1"/>
+      </w:pPr>
+      <w:r>
+        <w:t>Estructura del contenido</w:t>
+      </w:r>
+    </w:p>
+    <w:p>
+      <w:r>
+        <w:t>1. DiseÃ±o de la soluciÃ³n Â· 2. Diagramas y modelos Â· 3. Base de datos Â· 4. Interfaces Â· 5. Funcionalidades Â· 6. Proceso de desarrollo Â· 7. TecnologÃ­as Â· 8. Alcance funcional Â· 9. Dificultades y soluciones.</w:t>
+      </w:r>
+    </w:p>
+    <w:p>
+      <w:r>
+        <w:br w:type="page"/>
+      </w:r>
+    </w:p>
+    <w:p>
+      <w:pPr>
         <w:pStyle w:val="Title"/>
       </w:pPr>
       <w:r>
@@ -39,7 +191,7 @@
         <w:pStyle w:val="Normal"/>
       </w:pPr>
       <w:r>
-        <w:t xml:space="preserve">Mi Sonrisa Feliz es una aplicaciÃ³n web para administrar usuarios, pacientes, doctores, citas, consultas clÃ­nicas, facturaciÃ³n, inventario y reportes. La soluciÃ³n incorpora roles, agenda mÃ©dica, versiÃ³n inglÃ©s/espaÃ±ol, facturas imprimibles, diseÃ±o responsive y una base de datos MySQL con UTF-8.</w:t>
+        <w:t xml:space="preserve">Mi Sonrisa Feliz es una aplicaciÃ³n web orientada a administrar usuarios, pacientes, doctores, citas, consultas clÃ­nicas, facturaciÃ³n, inventario y reportes. La soluciÃ³n incorpora roles, agenda mÃ©dica, versiÃ³n inglÃ©s/espaÃ±ol, facturas imprimibles, diseÃ±o responsive y una base de datos MySQL con UTF-8.</w:t>
       </w:r>
     </w:p>
     <w:p>
@@ -311,7 +463,7 @@
         <w:ind w:left="720" w:hanging="360"/>
       </w:pPr>
       <w:r>
-        <w:t>â€¢ CRUD de usuarios, pacientes, doctores, especialidades, servicios, inventario y facturaciÃ³n.</w:t>
+        <w:t>â€¢ Operaciones de creaciÃ³n, consulta, actualizaciÃ³n y eliminaciÃ³n de usuarios, pacientes, doctores, especialidades, servicios, inventario y facturaciÃ³n.</w:t>
       </w:r>
     </w:p>
     <w:p>
@@ -519,7 +671,7 @@
         <w:pStyle w:val="Normal"/>
       </w:pPr>
       <w:r>
-        <w:t xml:space="preserve">La soluciÃ³n entrega una plataforma clÃ­nica organizada, segura y escalable. Su diseÃ±o modular permite ampliar catÃ¡logos, reportes y flujos de atenciÃ³n manteniendo una experiencia consistente en espaÃ±ol, inglÃ©s, escritorio y mÃ³vil.</w:t>
+        <w:t xml:space="preserve">La soluciÃ³n proporciona una plataforma clÃ­nica organizada, segura y escalable. Su diseÃ±o modular permite ampliar catÃ¡logos, reportes y flujos de atenciÃ³n manteniendo una experiencia consistente en espaÃ±ol, inglÃ©s, escritorio y mÃ³vil.</w:t>
       </w:r>
     </w:p>
     <w:sectPr>
@@ -534,8 +686,11 @@
 <w:styles xmlns:w="http://schemas.openxmlformats.org/wordprocessingml/2006/main">
   <w:style w:type="paragraph" w:default="1" w:styleId="Normal">
     <w:name w:val="Normal"/>
+    <w:pPr>
+      <w:spacing w:after="160" w:line="300" w:lineRule="auto"/>
+    </w:pPr>
     <w:rPr>
-      <w:rFonts w:ascii="Calibri" w:hAnsi="Calibri"/>
+      <w:rFonts w:ascii="Aptos" w:hAnsi="Aptos"/>
       <w:sz w:val="22"/>
     </w:rPr>
   </w:style>
@@ -544,7 +699,7 @@
     <w:rPr>
       <w:b/>
       <w:color w:val="1F5D2A"/>
-      <w:sz w:val="38"/>
+      <w:sz w:val="40"/>
     </w:rPr>
   </w:style>
   <w:style w:type="paragraph" w:styleId="Subtitle">
@@ -556,6 +711,9 @@
   </w:style>
   <w:style w:type="paragraph" w:styleId="Heading1">
     <w:name w:val="heading 1"/>
+    <w:pPr>
+      <w:spacing w:before="380" w:after="180"/>
+    </w:pPr>
     <w:rPr>
       <w:b/>
       <w:color w:val="1F5D2A"/>
@@ -564,6 +722,9 @@
   </w:style>
   <w:style w:type="paragraph" w:styleId="Caption">
     <w:name w:val="caption"/>
+    <w:pPr>
+      <w:jc w:val="center"/>
+    </w:pPr>
     <w:rPr>
       <w:i/>
       <w:color w:val="666666"/>

</xml_diff>